<commit_message>
Archive old assets and add chapter 3 flowchart
</commit_message>
<xml_diff>
--- a/文件修改/614526005_第三章_研究方法.docx
+++ b/文件修改/614526005_第三章_研究方法.docx
@@ -1806,6 +1806,579 @@
       </w:r>
       <w:r>
         <w:t>等指標，分析各模型於不同作物與不同預測天期下之預測表現。</w:t>
+      </w:r>
+    </w:p>
+    <w:p>
+      <w:pPr>
+        <w:pStyle w:val="Heading1"/>
+      </w:pPr>
+      <w:r>
+        <w:rPr>
+          <w:b/>
+          <w:rFonts w:ascii="Times New Roman" w:eastAsia="標楷體" w:hAnsi="Times New Roman"/>
+          <w:sz w:val="24"/>
+        </w:rPr>
+        <w:t xml:space="preserve">3.7 研究流程</w:t>
+      </w:r>
+    </w:p>
+    <w:p>
+      <w:r>
+        <w:rPr>
+          <w:rFonts w:ascii="Times New Roman" w:eastAsia="標楷體" w:hAnsi="Times New Roman"/>
+          <w:sz w:val="24"/>
+        </w:rPr>
+        <w:t xml:space="preserve">本研究之研究流程可分為資料蒐集、資料前處理、特徵建構、模型訓練、模型評估與結果比較等步驟。首先蒐集各作物之歷史交易資料與氣象資料，並依交易日期進行排序與清理。其次，將原始資料轉換為模型可使用之每日資料格式，建立價格落後項、移動平均、交易量與時間週期等特徵。最後，分別訓練多種預測模型，並以測試資料評估各模型於不同作物及不同預測天期下之表現。</w:t>
+      </w:r>
+    </w:p>
+    <w:tbl>
+      <w:tblPr>
+        <w:tblStyle w:val="TableGrid"/>
+        <w:tblW w:w="0" w:type="auto"/>
+        <w:tblBorders>
+          <w:top w:val="single" w:sz="4"/>
+          <w:left w:val="single" w:sz="4"/>
+          <w:bottom w:val="single" w:sz="4"/>
+          <w:right w:val="single" w:sz="4"/>
+          <w:insideH w:val="single" w:sz="4"/>
+          <w:insideV w:val="single" w:sz="4"/>
+        </w:tblBorders>
+      </w:tblPr>
+      <w:tr>
+        <w:tc>
+          <w:tcPr>
+            <w:tcW w:w="2400" w:type="dxa"/>
+          </w:tcPr>
+          <w:p>
+            <w:r>
+              <w:rPr>
+                <w:rFonts w:ascii="Times New Roman" w:eastAsia="標楷體" w:hAnsi="Times New Roman"/>
+                <w:sz w:val="24"/>
+              </w:rPr>
+              <w:t xml:space="preserve">步驟</w:t>
+            </w:r>
+          </w:p>
+        </w:tc>
+        <w:tc>
+          <w:tcPr>
+            <w:tcW w:w="2400" w:type="dxa"/>
+          </w:tcPr>
+          <w:p>
+            <w:r>
+              <w:rPr>
+                <w:rFonts w:ascii="Times New Roman" w:eastAsia="標楷體" w:hAnsi="Times New Roman"/>
+                <w:sz w:val="24"/>
+              </w:rPr>
+              <w:t xml:space="preserve">內容說明</w:t>
+            </w:r>
+          </w:p>
+        </w:tc>
+      </w:tr>
+      <w:tr>
+        <w:tc>
+          <w:tcPr>
+            <w:tcW w:w="2400" w:type="dxa"/>
+          </w:tcPr>
+          <w:p>
+            <w:r>
+              <w:rPr>
+                <w:rFonts w:ascii="Times New Roman" w:eastAsia="標楷體" w:hAnsi="Times New Roman"/>
+                <w:sz w:val="24"/>
+              </w:rPr>
+              <w:t xml:space="preserve">資料蒐集</w:t>
+            </w:r>
+          </w:p>
+        </w:tc>
+        <w:tc>
+          <w:tcPr>
+            <w:tcW w:w="2400" w:type="dxa"/>
+          </w:tcPr>
+          <w:p>
+            <w:r>
+              <w:rPr>
+                <w:rFonts w:ascii="Times New Roman" w:eastAsia="標楷體" w:hAnsi="Times New Roman"/>
+                <w:sz w:val="24"/>
+              </w:rPr>
+              <w:t xml:space="preserve">蒐集農產品交易價格、交易量、市場資訊與氣象資料</w:t>
+            </w:r>
+          </w:p>
+        </w:tc>
+      </w:tr>
+      <w:tr>
+        <w:tc>
+          <w:tcPr>
+            <w:tcW w:w="2400" w:type="dxa"/>
+          </w:tcPr>
+          <w:p>
+            <w:r>
+              <w:rPr>
+                <w:rFonts w:ascii="Times New Roman" w:eastAsia="標楷體" w:hAnsi="Times New Roman"/>
+                <w:sz w:val="24"/>
+              </w:rPr>
+              <w:t xml:space="preserve">資料前處理</w:t>
+            </w:r>
+          </w:p>
+        </w:tc>
+        <w:tc>
+          <w:tcPr>
+            <w:tcW w:w="2400" w:type="dxa"/>
+          </w:tcPr>
+          <w:p>
+            <w:r>
+              <w:rPr>
+                <w:rFonts w:ascii="Times New Roman" w:eastAsia="標楷體" w:hAnsi="Times New Roman"/>
+                <w:sz w:val="24"/>
+              </w:rPr>
+              <w:t xml:space="preserve">處理日期格式、缺漏值、資料排序與時間切分</w:t>
+            </w:r>
+          </w:p>
+        </w:tc>
+      </w:tr>
+      <w:tr>
+        <w:tc>
+          <w:tcPr>
+            <w:tcW w:w="2400" w:type="dxa"/>
+          </w:tcPr>
+          <w:p>
+            <w:r>
+              <w:rPr>
+                <w:rFonts w:ascii="Times New Roman" w:eastAsia="標楷體" w:hAnsi="Times New Roman"/>
+                <w:sz w:val="24"/>
+              </w:rPr>
+              <w:t xml:space="preserve">特徵建構</w:t>
+            </w:r>
+          </w:p>
+        </w:tc>
+        <w:tc>
+          <w:tcPr>
+            <w:tcW w:w="2400" w:type="dxa"/>
+          </w:tcPr>
+          <w:p>
+            <w:r>
+              <w:rPr>
+                <w:rFonts w:ascii="Times New Roman" w:eastAsia="標楷體" w:hAnsi="Times New Roman"/>
+                <w:sz w:val="24"/>
+              </w:rPr>
+              <w:t xml:space="preserve">建立落後期價格、移動平均、交易量、時間與氣象特徵</w:t>
+            </w:r>
+          </w:p>
+        </w:tc>
+      </w:tr>
+      <w:tr>
+        <w:tc>
+          <w:tcPr>
+            <w:tcW w:w="2400" w:type="dxa"/>
+          </w:tcPr>
+          <w:p>
+            <w:r>
+              <w:rPr>
+                <w:rFonts w:ascii="Times New Roman" w:eastAsia="標楷體" w:hAnsi="Times New Roman"/>
+                <w:sz w:val="24"/>
+              </w:rPr>
+              <w:t xml:space="preserve">模型訓練</w:t>
+            </w:r>
+          </w:p>
+        </w:tc>
+        <w:tc>
+          <w:tcPr>
+            <w:tcW w:w="2400" w:type="dxa"/>
+          </w:tcPr>
+          <w:p>
+            <w:r>
+              <w:rPr>
+                <w:rFonts w:ascii="Times New Roman" w:eastAsia="標楷體" w:hAnsi="Times New Roman"/>
+                <w:sz w:val="24"/>
+              </w:rPr>
+              <w:t xml:space="preserve">訓練 Ridge、Random Forest、XGBoost、LightGBM、SARIMA 與 Prophet</w:t>
+            </w:r>
+          </w:p>
+        </w:tc>
+      </w:tr>
+      <w:tr>
+        <w:tc>
+          <w:tcPr>
+            <w:tcW w:w="2400" w:type="dxa"/>
+          </w:tcPr>
+          <w:p>
+            <w:r>
+              <w:rPr>
+                <w:rFonts w:ascii="Times New Roman" w:eastAsia="標楷體" w:hAnsi="Times New Roman"/>
+                <w:sz w:val="24"/>
+              </w:rPr>
+              <w:t xml:space="preserve">模型評估</w:t>
+            </w:r>
+          </w:p>
+        </w:tc>
+        <w:tc>
+          <w:tcPr>
+            <w:tcW w:w="2400" w:type="dxa"/>
+          </w:tcPr>
+          <w:p>
+            <w:r>
+              <w:rPr>
+                <w:rFonts w:ascii="Times New Roman" w:eastAsia="標楷體" w:hAnsi="Times New Roman"/>
+                <w:sz w:val="24"/>
+              </w:rPr>
+              <w:t xml:space="preserve">以 MAE、RMSE、MAPE 與 R² 比較模型預測能力</w:t>
+            </w:r>
+          </w:p>
+        </w:tc>
+      </w:tr>
+      <w:tr>
+        <w:tc>
+          <w:tcPr>
+            <w:tcW w:w="2400" w:type="dxa"/>
+          </w:tcPr>
+          <w:p>
+            <w:r>
+              <w:rPr>
+                <w:rFonts w:ascii="Times New Roman" w:eastAsia="標楷體" w:hAnsi="Times New Roman"/>
+                <w:sz w:val="24"/>
+              </w:rPr>
+              <w:t xml:space="preserve">結果解釋</w:t>
+            </w:r>
+          </w:p>
+        </w:tc>
+        <w:tc>
+          <w:tcPr>
+            <w:tcW w:w="2400" w:type="dxa"/>
+          </w:tcPr>
+          <w:p>
+            <w:r>
+              <w:rPr>
+                <w:rFonts w:ascii="Times New Roman" w:eastAsia="標楷體" w:hAnsi="Times New Roman"/>
+                <w:sz w:val="24"/>
+              </w:rPr>
+              <w:t xml:space="preserve">分析不同作物與不同預測天期之模型表現差異</w:t>
+            </w:r>
+          </w:p>
+        </w:tc>
+      </w:tr>
+    </w:tbl>
+    <w:p>
+      <w:pPr>
+        <w:pStyle w:val="Heading1"/>
+      </w:pPr>
+      <w:r>
+        <w:rPr>
+          <w:b/>
+          <w:rFonts w:ascii="Times New Roman" w:eastAsia="標楷體" w:hAnsi="Times New Roman"/>
+          <w:sz w:val="24"/>
+        </w:rPr>
+        <w:t xml:space="preserve">3.8 預測任務設計</w:t>
+      </w:r>
+    </w:p>
+    <w:p>
+      <w:r>
+        <w:rPr>
+          <w:rFonts w:ascii="Times New Roman" w:eastAsia="標楷體" w:hAnsi="Times New Roman"/>
+          <w:sz w:val="24"/>
+        </w:rPr>
+        <w:t xml:space="preserve">本研究將農產品價格預測設定為監督式學習中的回歸問題。模型輸入為特定日期以前可取得之歷史交易資訊、時間特徵與氣象特徵，模型輸出則為未來特定天期之價格。為比較預測天期對模型表現之影響，本研究分別建立 1 日、5 日、7 日與 14 日預測任務。</w:t>
+      </w:r>
+    </w:p>
+    <w:p>
+      <w:r>
+        <w:rPr>
+          <w:rFonts w:ascii="Times New Roman" w:eastAsia="標楷體" w:hAnsi="Times New Roman"/>
+          <w:sz w:val="24"/>
+        </w:rPr>
+        <w:t xml:space="preserve">其中，1 日預測主要用於觀察模型對短期價格變化之掌握能力；5 日預測可作為短週期市場判斷依據；7 日與 14 日預測則用以評估模型在較長天期下之穩定性。由於農產品價格容易受到天氣、供需與突發事件影響，預測天期越長，模型面臨的不確定性通常越高。</w:t>
+      </w:r>
+    </w:p>
+    <w:tbl>
+      <w:tblPr>
+        <w:tblStyle w:val="TableGrid"/>
+        <w:tblW w:w="0" w:type="auto"/>
+        <w:tblBorders>
+          <w:top w:val="single" w:sz="4"/>
+          <w:left w:val="single" w:sz="4"/>
+          <w:bottom w:val="single" w:sz="4"/>
+          <w:right w:val="single" w:sz="4"/>
+          <w:insideH w:val="single" w:sz="4"/>
+          <w:insideV w:val="single" w:sz="4"/>
+        </w:tblBorders>
+      </w:tblPr>
+      <w:tr>
+        <w:tc>
+          <w:tcPr>
+            <w:tcW w:w="2400" w:type="dxa"/>
+          </w:tcPr>
+          <w:p>
+            <w:r>
+              <w:rPr>
+                <w:rFonts w:ascii="Times New Roman" w:eastAsia="標楷體" w:hAnsi="Times New Roman"/>
+                <w:sz w:val="24"/>
+              </w:rPr>
+              <w:t xml:space="preserve">預測天期</w:t>
+            </w:r>
+          </w:p>
+        </w:tc>
+        <w:tc>
+          <w:tcPr>
+            <w:tcW w:w="2400" w:type="dxa"/>
+          </w:tcPr>
+          <w:p>
+            <w:r>
+              <w:rPr>
+                <w:rFonts w:ascii="Times New Roman" w:eastAsia="標楷體" w:hAnsi="Times New Roman"/>
+                <w:sz w:val="24"/>
+              </w:rPr>
+              <w:t xml:space="preserve">任務說明</w:t>
+            </w:r>
+          </w:p>
+        </w:tc>
+        <w:tc>
+          <w:tcPr>
+            <w:tcW w:w="2400" w:type="dxa"/>
+          </w:tcPr>
+          <w:p>
+            <w:r>
+              <w:rPr>
+                <w:rFonts w:ascii="Times New Roman" w:eastAsia="標楷體" w:hAnsi="Times New Roman"/>
+                <w:sz w:val="24"/>
+              </w:rPr>
+              <w:t xml:space="preserve">實務意義</w:t>
+            </w:r>
+          </w:p>
+        </w:tc>
+      </w:tr>
+      <w:tr>
+        <w:tc>
+          <w:tcPr>
+            <w:tcW w:w="2400" w:type="dxa"/>
+          </w:tcPr>
+          <w:p>
+            <w:r>
+              <w:rPr>
+                <w:rFonts w:ascii="Times New Roman" w:eastAsia="標楷體" w:hAnsi="Times New Roman"/>
+                <w:sz w:val="24"/>
+              </w:rPr>
+              <w:t xml:space="preserve">1 日</w:t>
+            </w:r>
+          </w:p>
+        </w:tc>
+        <w:tc>
+          <w:tcPr>
+            <w:tcW w:w="2400" w:type="dxa"/>
+          </w:tcPr>
+          <w:p>
+            <w:r>
+              <w:rPr>
+                <w:rFonts w:ascii="Times New Roman" w:eastAsia="標楷體" w:hAnsi="Times New Roman"/>
+                <w:sz w:val="24"/>
+              </w:rPr>
+              <w:t xml:space="preserve">預測隔日價格</w:t>
+            </w:r>
+          </w:p>
+        </w:tc>
+        <w:tc>
+          <w:tcPr>
+            <w:tcW w:w="2400" w:type="dxa"/>
+          </w:tcPr>
+          <w:p>
+            <w:r>
+              <w:rPr>
+                <w:rFonts w:ascii="Times New Roman" w:eastAsia="標楷體" w:hAnsi="Times New Roman"/>
+                <w:sz w:val="24"/>
+              </w:rPr>
+              <w:t xml:space="preserve">短期市場價格參考</w:t>
+            </w:r>
+          </w:p>
+        </w:tc>
+      </w:tr>
+      <w:tr>
+        <w:tc>
+          <w:tcPr>
+            <w:tcW w:w="2400" w:type="dxa"/>
+          </w:tcPr>
+          <w:p>
+            <w:r>
+              <w:rPr>
+                <w:rFonts w:ascii="Times New Roman" w:eastAsia="標楷體" w:hAnsi="Times New Roman"/>
+                <w:sz w:val="24"/>
+              </w:rPr>
+              <w:t xml:space="preserve">5 日</w:t>
+            </w:r>
+          </w:p>
+        </w:tc>
+        <w:tc>
+          <w:tcPr>
+            <w:tcW w:w="2400" w:type="dxa"/>
+          </w:tcPr>
+          <w:p>
+            <w:r>
+              <w:rPr>
+                <w:rFonts w:ascii="Times New Roman" w:eastAsia="標楷體" w:hAnsi="Times New Roman"/>
+                <w:sz w:val="24"/>
+              </w:rPr>
+              <w:t xml:space="preserve">預測 5 日後價格</w:t>
+            </w:r>
+          </w:p>
+        </w:tc>
+        <w:tc>
+          <w:tcPr>
+            <w:tcW w:w="2400" w:type="dxa"/>
+          </w:tcPr>
+          <w:p>
+            <w:r>
+              <w:rPr>
+                <w:rFonts w:ascii="Times New Roman" w:eastAsia="標楷體" w:hAnsi="Times New Roman"/>
+                <w:sz w:val="24"/>
+              </w:rPr>
+              <w:t xml:space="preserve">短期供銷與決策輔助</w:t>
+            </w:r>
+          </w:p>
+        </w:tc>
+      </w:tr>
+      <w:tr>
+        <w:tc>
+          <w:tcPr>
+            <w:tcW w:w="2400" w:type="dxa"/>
+          </w:tcPr>
+          <w:p>
+            <w:r>
+              <w:rPr>
+                <w:rFonts w:ascii="Times New Roman" w:eastAsia="標楷體" w:hAnsi="Times New Roman"/>
+                <w:sz w:val="24"/>
+              </w:rPr>
+              <w:t xml:space="preserve">7 日</w:t>
+            </w:r>
+          </w:p>
+        </w:tc>
+        <w:tc>
+          <w:tcPr>
+            <w:tcW w:w="2400" w:type="dxa"/>
+          </w:tcPr>
+          <w:p>
+            <w:r>
+              <w:rPr>
+                <w:rFonts w:ascii="Times New Roman" w:eastAsia="標楷體" w:hAnsi="Times New Roman"/>
+                <w:sz w:val="24"/>
+              </w:rPr>
+              <w:t xml:space="preserve">預測 7 日後價格</w:t>
+            </w:r>
+          </w:p>
+        </w:tc>
+        <w:tc>
+          <w:tcPr>
+            <w:tcW w:w="2400" w:type="dxa"/>
+          </w:tcPr>
+          <w:p>
+            <w:r>
+              <w:rPr>
+                <w:rFonts w:ascii="Times New Roman" w:eastAsia="標楷體" w:hAnsi="Times New Roman"/>
+                <w:sz w:val="24"/>
+              </w:rPr>
+              <w:t xml:space="preserve">週期性價格趨勢觀察</w:t>
+            </w:r>
+          </w:p>
+        </w:tc>
+      </w:tr>
+      <w:tr>
+        <w:tc>
+          <w:tcPr>
+            <w:tcW w:w="2400" w:type="dxa"/>
+          </w:tcPr>
+          <w:p>
+            <w:r>
+              <w:rPr>
+                <w:rFonts w:ascii="Times New Roman" w:eastAsia="標楷體" w:hAnsi="Times New Roman"/>
+                <w:sz w:val="24"/>
+              </w:rPr>
+              <w:t xml:space="preserve">14 日</w:t>
+            </w:r>
+          </w:p>
+        </w:tc>
+        <w:tc>
+          <w:tcPr>
+            <w:tcW w:w="2400" w:type="dxa"/>
+          </w:tcPr>
+          <w:p>
+            <w:r>
+              <w:rPr>
+                <w:rFonts w:ascii="Times New Roman" w:eastAsia="標楷體" w:hAnsi="Times New Roman"/>
+                <w:sz w:val="24"/>
+              </w:rPr>
+              <w:t xml:space="preserve">預測 14 日後價格</w:t>
+            </w:r>
+          </w:p>
+        </w:tc>
+        <w:tc>
+          <w:tcPr>
+            <w:tcW w:w="2400" w:type="dxa"/>
+          </w:tcPr>
+          <w:p>
+            <w:r>
+              <w:rPr>
+                <w:rFonts w:ascii="Times New Roman" w:eastAsia="標楷體" w:hAnsi="Times New Roman"/>
+                <w:sz w:val="24"/>
+              </w:rPr>
+              <w:t xml:space="preserve">中短期價格風險評估</w:t>
+            </w:r>
+          </w:p>
+        </w:tc>
+      </w:tr>
+    </w:tbl>
+    <w:p>
+      <w:pPr>
+        <w:pStyle w:val="Heading1"/>
+      </w:pPr>
+      <w:r>
+        <w:rPr>
+          <w:b/>
+          <w:rFonts w:ascii="Times New Roman" w:eastAsia="標楷體" w:hAnsi="Times New Roman"/>
+          <w:sz w:val="24"/>
+        </w:rPr>
+        <w:t xml:space="preserve">3.9 模型訓練與比較方式</w:t>
+      </w:r>
+    </w:p>
+    <w:p>
+      <w:r>
+        <w:rPr>
+          <w:rFonts w:ascii="Times New Roman" w:eastAsia="標楷體" w:hAnsi="Times New Roman"/>
+          <w:sz w:val="24"/>
+        </w:rPr>
+        <w:t xml:space="preserve">模型訓練階段採用相同訓練集與測試集進行比較，以確保不同模型之評估基準一致。機器學習模型使用相同特徵集合進行訓練，並分別輸出測試期間之預測價格。時間序列模型則以歷史價格序列及可用外生變數進行建模，作為傳統預測方法之比較基準。</w:t>
+      </w:r>
+    </w:p>
+    <w:p>
+      <w:r>
+        <w:rPr>
+          <w:rFonts w:ascii="Times New Roman" w:eastAsia="標楷體" w:hAnsi="Times New Roman"/>
+          <w:sz w:val="24"/>
+        </w:rPr>
+        <w:t xml:space="preserve">在模型比較時，本研究不僅觀察單一指標，而是同時參考 MAE、RMSE、MAPE 與 R²。若模型具有較低 MAE、RMSE、MAPE 且 R² 較高，代表其預測誤差較小且對價格變動具有較佳解釋能力。當不同指標排序不完全一致時，則以研究目的進行判斷；若重視實際價格誤差，可優先參考 MAE 與 RMSE；若需比較不同作物間之相對誤差，則優先參考 MAPE。</w:t>
+      </w:r>
+    </w:p>
+    <w:p>
+      <w:pPr>
+        <w:pStyle w:val="Heading1"/>
+      </w:pPr>
+      <w:r>
+        <w:rPr>
+          <w:b/>
+          <w:rFonts w:ascii="Times New Roman" w:eastAsia="標楷體" w:hAnsi="Times New Roman"/>
+          <w:sz w:val="24"/>
+        </w:rPr>
+        <w:t xml:space="preserve">3.10 研究限制</w:t>
+      </w:r>
+    </w:p>
+    <w:p>
+      <w:r>
+        <w:rPr>
+          <w:rFonts w:ascii="Times New Roman" w:eastAsia="標楷體" w:hAnsi="Times New Roman"/>
+          <w:sz w:val="24"/>
+        </w:rPr>
+        <w:t xml:space="preserve">本研究雖已納入歷史交易資料、時間特徵與氣象特徵，但農產品價格仍可能受到突發天災、政策變動、進口量、節日需求、產地供給與市場休市等因素影響。若上述因素未完整反映於資料中，模型預測結果仍可能與實際價格產生落差。</w:t>
+      </w:r>
+    </w:p>
+    <w:p>
+      <w:r>
+        <w:rPr>
+          <w:rFonts w:ascii="Times New Roman" w:eastAsia="標楷體" w:hAnsi="Times New Roman"/>
+          <w:sz w:val="24"/>
+        </w:rPr>
+        <w:t xml:space="preserve">此外，本研究之模型主要以歷史資料進行訓練，適合用於短期價格趨勢判斷與輔助決策，不宜直接視為絕對價格。未來若能加入更完整之前瞻性資料，例如未來天氣預報、颱風警報、節日與市場休市資訊、產量與進口資料，將有助於提升 7 日與 14 日預測之穩定性。</w:t>
       </w:r>
     </w:p>
     <w:sectPr>

</xml_diff>